<commit_message>
Aplicar revisión final de Indira al manual
</commit_message>
<xml_diff>
--- a/Guia_reconstruccion_psicologica_Indira_Parra_Antonio_Arnal.docx
+++ b/Guia_reconstruccion_psicologica_Indira_Parra_Antonio_Arnal.docx
@@ -13,7 +13,7 @@
           <w:b w:val="0"/>
           <w:i w:val="0"/>
         </w:rPr>
-        <w:t>GUÍA DE RECONSTRUCCIÓN PSICOLÓGICA</w:t>
+        <w:t>GUÍA DE RECONSTRUCCIÓN PSICOLÓGICA DE UNA CATÁSTROFE</w:t>
       </w:r>
     </w:p>
     <w:p>
@@ -26,7 +26,7 @@
           <w:b w:val="0"/>
           <w:i w:val="0"/>
         </w:rPr>
-        <w:t>Cuando todo se derrumba por dentro y por fuera</w:t>
+        <w:t>Venezuela</w:t>
       </w:r>
     </w:p>
     <w:p>
@@ -173,6 +173,25 @@
           <w:i w:val="0"/>
         </w:rPr>
         <w:t>© 2026 Indira Lucía Parra y Antonio José Arnal Meinhardt. Todos los derechos reservados. Se autoriza compartir gratuitamente esta obra completa, sin modificaciones y reconociendo la autoría, para fines personales, educativos, sanitarios o humanitarios no comerciales. Cualquier adaptación, venta por terceros o uso comercial requiere autorización escrita de los autores.</w:t>
+      </w:r>
+    </w:p>
+    <w:p>
+      <w:pPr/>
+      <w:r>
+        <w:rPr>
+          <w:rFonts w:ascii="Georgia" w:hAnsi="Georgia"/>
+          <w:b/>
+          <w:i w:val="0"/>
+        </w:rPr>
+        <w:t>ISBN de la edición impresa:</w:t>
+      </w:r>
+      <w:r>
+        <w:rPr>
+          <w:rFonts w:ascii="Georgia" w:hAnsi="Georgia"/>
+          <w:b w:val="0"/>
+          <w:i w:val="0"/>
+        </w:rPr>
+        <w:t xml:space="preserve"> 9798190186116</w:t>
       </w:r>
     </w:p>
     <w:p>
@@ -477,7 +496,7 @@
                 <w:color w:val="9A6B32"/>
                 <w:sz w:val="20"/>
               </w:rPr>
-              <w:t>11</w:t>
+              <w:t>12</w:t>
             </w:r>
           </w:p>
         </w:tc>
@@ -539,7 +558,7 @@
                 <w:color w:val="9A6B32"/>
                 <w:sz w:val="20"/>
               </w:rPr>
-              <w:t>21</w:t>
+              <w:t>23</w:t>
             </w:r>
           </w:p>
         </w:tc>
@@ -601,7 +620,7 @@
                 <w:color w:val="9A6B32"/>
                 <w:sz w:val="20"/>
               </w:rPr>
-              <w:t>32</w:t>
+              <w:t>35</w:t>
             </w:r>
           </w:p>
         </w:tc>
@@ -663,7 +682,7 @@
                 <w:color w:val="9A6B32"/>
                 <w:sz w:val="20"/>
               </w:rPr>
-              <w:t>45</w:t>
+              <w:t>49</w:t>
             </w:r>
           </w:p>
         </w:tc>
@@ -725,7 +744,7 @@
                 <w:color w:val="9A6B32"/>
                 <w:sz w:val="20"/>
               </w:rPr>
-              <w:t>54</w:t>
+              <w:t>59</w:t>
             </w:r>
           </w:p>
         </w:tc>
@@ -787,7 +806,7 @@
                 <w:color w:val="9A6B32"/>
                 <w:sz w:val="20"/>
               </w:rPr>
-              <w:t>63</w:t>
+              <w:t>70</w:t>
             </w:r>
           </w:p>
         </w:tc>
@@ -849,7 +868,7 @@
                 <w:color w:val="9A6B32"/>
                 <w:sz w:val="20"/>
               </w:rPr>
-              <w:t>70</w:t>
+              <w:t>78</w:t>
             </w:r>
           </w:p>
         </w:tc>
@@ -911,7 +930,7 @@
                 <w:color w:val="9A6B32"/>
                 <w:sz w:val="20"/>
               </w:rPr>
-              <w:t>78</w:t>
+              <w:t>88</w:t>
             </w:r>
           </w:p>
         </w:tc>
@@ -964,7 +983,7 @@
                 <w:color w:val="9A6B32"/>
                 <w:sz w:val="20"/>
               </w:rPr>
-              <w:t>83</w:t>
+              <w:t>93</w:t>
             </w:r>
           </w:p>
         </w:tc>
@@ -1017,7 +1036,7 @@
                 <w:color w:val="9A6B32"/>
                 <w:sz w:val="20"/>
               </w:rPr>
-              <w:t>85</w:t>
+              <w:t>95</w:t>
             </w:r>
           </w:p>
         </w:tc>
@@ -1070,7 +1089,7 @@
                 <w:color w:val="9A6B32"/>
                 <w:sz w:val="20"/>
               </w:rPr>
-              <w:t>88</w:t>
+              <w:t>98</w:t>
             </w:r>
           </w:p>
         </w:tc>
@@ -1154,6 +1173,19 @@
     </w:p>
     <w:p>
       <w:pPr>
+        <w:pStyle w:val="BlockQuote"/>
+      </w:pPr>
+      <w:r>
+        <w:rPr>
+          <w:rFonts w:ascii="Georgia" w:hAnsi="Georgia"/>
+          <w:b w:val="0"/>
+          <w:i/>
+        </w:rPr>
+        <w:t>Cuando todo se derrumba, permanecer puede ser el primer acto de reconstrucción.</w:t>
+      </w:r>
+    </w:p>
+    <w:p>
+      <w:pPr>
         <w:pStyle w:val="ListBullet"/>
       </w:pPr>
       <w:r>
@@ -1472,6 +1504,219 @@
           <w:i w:val="0"/>
         </w:rPr>
         <w:t>Si al leer una escena sientes que tu cuerpo se activa demasiado, detente. Mira a tu alrededor. Nombra cinco cosas que ves. Apoya los pies. Busca a alguien. Leer también debe dosificarse.</w:t>
+      </w:r>
+    </w:p>
+    <w:p>
+      <w:r>
+        <w:br w:type="page"/>
+      </w:r>
+    </w:p>
+    <w:p>
+      <w:pPr>
+        <w:pStyle w:val="Heading2"/>
+      </w:pPr>
+      <w:r>
+        <w:rPr>
+          <w:rFonts w:ascii="Georgia" w:hAnsi="Georgia"/>
+          <w:b w:val="0"/>
+          <w:i w:val="0"/>
+        </w:rPr>
+        <w:t>Mis notas</w:t>
+      </w:r>
+    </w:p>
+    <w:p>
+      <w:pPr>
+        <w:pStyle w:val="Worksheet"/>
+      </w:pPr>
+      <w:r>
+        <w:rPr>
+          <w:rFonts w:ascii="Georgia" w:hAnsi="Georgia"/>
+          <w:b w:val="0"/>
+          <w:i w:val="0"/>
+        </w:rPr>
+        <w:t>________________________________________</w:t>
+      </w:r>
+    </w:p>
+    <w:p>
+      <w:pPr>
+        <w:pStyle w:val="Worksheet"/>
+      </w:pPr>
+      <w:r>
+        <w:rPr>
+          <w:rFonts w:ascii="Georgia" w:hAnsi="Georgia"/>
+          <w:b w:val="0"/>
+          <w:i w:val="0"/>
+        </w:rPr>
+        <w:t>________________________________________</w:t>
+      </w:r>
+    </w:p>
+    <w:p>
+      <w:pPr>
+        <w:pStyle w:val="Worksheet"/>
+      </w:pPr>
+      <w:r>
+        <w:rPr>
+          <w:rFonts w:ascii="Georgia" w:hAnsi="Georgia"/>
+          <w:b w:val="0"/>
+          <w:i w:val="0"/>
+        </w:rPr>
+        <w:t>________________________________________</w:t>
+      </w:r>
+    </w:p>
+    <w:p>
+      <w:pPr>
+        <w:pStyle w:val="Worksheet"/>
+      </w:pPr>
+      <w:r>
+        <w:rPr>
+          <w:rFonts w:ascii="Georgia" w:hAnsi="Georgia"/>
+          <w:b w:val="0"/>
+          <w:i w:val="0"/>
+        </w:rPr>
+        <w:t>________________________________________</w:t>
+      </w:r>
+    </w:p>
+    <w:p>
+      <w:pPr>
+        <w:pStyle w:val="Worksheet"/>
+      </w:pPr>
+      <w:r>
+        <w:rPr>
+          <w:rFonts w:ascii="Georgia" w:hAnsi="Georgia"/>
+          <w:b w:val="0"/>
+          <w:i w:val="0"/>
+        </w:rPr>
+        <w:t>________________________________________</w:t>
+      </w:r>
+    </w:p>
+    <w:p>
+      <w:pPr>
+        <w:pStyle w:val="Worksheet"/>
+      </w:pPr>
+      <w:r>
+        <w:rPr>
+          <w:rFonts w:ascii="Georgia" w:hAnsi="Georgia"/>
+          <w:b w:val="0"/>
+          <w:i w:val="0"/>
+        </w:rPr>
+        <w:t>________________________________________</w:t>
+      </w:r>
+    </w:p>
+    <w:p>
+      <w:pPr>
+        <w:pStyle w:val="Worksheet"/>
+      </w:pPr>
+      <w:r>
+        <w:rPr>
+          <w:rFonts w:ascii="Georgia" w:hAnsi="Georgia"/>
+          <w:b w:val="0"/>
+          <w:i w:val="0"/>
+        </w:rPr>
+        <w:t>________________________________________</w:t>
+      </w:r>
+    </w:p>
+    <w:p>
+      <w:pPr>
+        <w:pStyle w:val="Worksheet"/>
+      </w:pPr>
+      <w:r>
+        <w:rPr>
+          <w:rFonts w:ascii="Georgia" w:hAnsi="Georgia"/>
+          <w:b w:val="0"/>
+          <w:i w:val="0"/>
+        </w:rPr>
+        <w:t>________________________________________</w:t>
+      </w:r>
+    </w:p>
+    <w:p>
+      <w:pPr>
+        <w:pStyle w:val="Worksheet"/>
+      </w:pPr>
+      <w:r>
+        <w:rPr>
+          <w:rFonts w:ascii="Georgia" w:hAnsi="Georgia"/>
+          <w:b w:val="0"/>
+          <w:i w:val="0"/>
+        </w:rPr>
+        <w:t>________________________________________</w:t>
+      </w:r>
+    </w:p>
+    <w:p>
+      <w:pPr>
+        <w:pStyle w:val="Worksheet"/>
+      </w:pPr>
+      <w:r>
+        <w:rPr>
+          <w:rFonts w:ascii="Georgia" w:hAnsi="Georgia"/>
+          <w:b w:val="0"/>
+          <w:i w:val="0"/>
+        </w:rPr>
+        <w:t>________________________________________</w:t>
+      </w:r>
+    </w:p>
+    <w:p>
+      <w:pPr>
+        <w:pStyle w:val="Worksheet"/>
+      </w:pPr>
+      <w:r>
+        <w:rPr>
+          <w:rFonts w:ascii="Georgia" w:hAnsi="Georgia"/>
+          <w:b w:val="0"/>
+          <w:i w:val="0"/>
+        </w:rPr>
+        <w:t>________________________________________</w:t>
+      </w:r>
+    </w:p>
+    <w:p>
+      <w:pPr>
+        <w:pStyle w:val="Worksheet"/>
+      </w:pPr>
+      <w:r>
+        <w:rPr>
+          <w:rFonts w:ascii="Georgia" w:hAnsi="Georgia"/>
+          <w:b w:val="0"/>
+          <w:i w:val="0"/>
+        </w:rPr>
+        <w:t>________________________________________</w:t>
+      </w:r>
+    </w:p>
+    <w:p>
+      <w:pPr>
+        <w:pStyle w:val="Worksheet"/>
+      </w:pPr>
+      <w:r>
+        <w:rPr>
+          <w:rFonts w:ascii="Georgia" w:hAnsi="Georgia"/>
+          <w:b w:val="0"/>
+          <w:i w:val="0"/>
+        </w:rPr>
+        <w:t>________________________________________</w:t>
+      </w:r>
+    </w:p>
+    <w:p>
+      <w:pPr>
+        <w:pStyle w:val="Worksheet"/>
+      </w:pPr>
+      <w:r>
+        <w:rPr>
+          <w:rFonts w:ascii="Georgia" w:hAnsi="Georgia"/>
+          <w:b w:val="0"/>
+          <w:i w:val="0"/>
+        </w:rPr>
+        <w:t>________________________________________</w:t>
+      </w:r>
+    </w:p>
+    <w:p>
+      <w:pPr>
+        <w:pStyle w:val="Worksheet"/>
+      </w:pPr>
+      <w:r>
+        <w:rPr>
+          <w:rFonts w:ascii="Georgia" w:hAnsi="Georgia"/>
+          <w:b w:val="0"/>
+          <w:i w:val="0"/>
+        </w:rPr>
+        <w:t>________________________________________</w:t>
       </w:r>
     </w:p>
     <w:p>
@@ -2627,6 +2872,219 @@
     </w:p>
     <w:p>
       <w:pPr>
+        <w:pStyle w:val="Heading2"/>
+      </w:pPr>
+      <w:r>
+        <w:rPr>
+          <w:rFonts w:ascii="Georgia" w:hAnsi="Georgia"/>
+          <w:b w:val="0"/>
+          <w:i w:val="0"/>
+        </w:rPr>
+        <w:t>Mis notas</w:t>
+      </w:r>
+    </w:p>
+    <w:p>
+      <w:pPr>
+        <w:pStyle w:val="Worksheet"/>
+      </w:pPr>
+      <w:r>
+        <w:rPr>
+          <w:rFonts w:ascii="Georgia" w:hAnsi="Georgia"/>
+          <w:b w:val="0"/>
+          <w:i w:val="0"/>
+        </w:rPr>
+        <w:t>________________________________________</w:t>
+      </w:r>
+    </w:p>
+    <w:p>
+      <w:pPr>
+        <w:pStyle w:val="Worksheet"/>
+      </w:pPr>
+      <w:r>
+        <w:rPr>
+          <w:rFonts w:ascii="Georgia" w:hAnsi="Georgia"/>
+          <w:b w:val="0"/>
+          <w:i w:val="0"/>
+        </w:rPr>
+        <w:t>________________________________________</w:t>
+      </w:r>
+    </w:p>
+    <w:p>
+      <w:pPr>
+        <w:pStyle w:val="Worksheet"/>
+      </w:pPr>
+      <w:r>
+        <w:rPr>
+          <w:rFonts w:ascii="Georgia" w:hAnsi="Georgia"/>
+          <w:b w:val="0"/>
+          <w:i w:val="0"/>
+        </w:rPr>
+        <w:t>________________________________________</w:t>
+      </w:r>
+    </w:p>
+    <w:p>
+      <w:pPr>
+        <w:pStyle w:val="Worksheet"/>
+      </w:pPr>
+      <w:r>
+        <w:rPr>
+          <w:rFonts w:ascii="Georgia" w:hAnsi="Georgia"/>
+          <w:b w:val="0"/>
+          <w:i w:val="0"/>
+        </w:rPr>
+        <w:t>________________________________________</w:t>
+      </w:r>
+    </w:p>
+    <w:p>
+      <w:pPr>
+        <w:pStyle w:val="Worksheet"/>
+      </w:pPr>
+      <w:r>
+        <w:rPr>
+          <w:rFonts w:ascii="Georgia" w:hAnsi="Georgia"/>
+          <w:b w:val="0"/>
+          <w:i w:val="0"/>
+        </w:rPr>
+        <w:t>________________________________________</w:t>
+      </w:r>
+    </w:p>
+    <w:p>
+      <w:pPr>
+        <w:pStyle w:val="Worksheet"/>
+      </w:pPr>
+      <w:r>
+        <w:rPr>
+          <w:rFonts w:ascii="Georgia" w:hAnsi="Georgia"/>
+          <w:b w:val="0"/>
+          <w:i w:val="0"/>
+        </w:rPr>
+        <w:t>________________________________________</w:t>
+      </w:r>
+    </w:p>
+    <w:p>
+      <w:pPr>
+        <w:pStyle w:val="Worksheet"/>
+      </w:pPr>
+      <w:r>
+        <w:rPr>
+          <w:rFonts w:ascii="Georgia" w:hAnsi="Georgia"/>
+          <w:b w:val="0"/>
+          <w:i w:val="0"/>
+        </w:rPr>
+        <w:t>________________________________________</w:t>
+      </w:r>
+    </w:p>
+    <w:p>
+      <w:pPr>
+        <w:pStyle w:val="Worksheet"/>
+      </w:pPr>
+      <w:r>
+        <w:rPr>
+          <w:rFonts w:ascii="Georgia" w:hAnsi="Georgia"/>
+          <w:b w:val="0"/>
+          <w:i w:val="0"/>
+        </w:rPr>
+        <w:t>________________________________________</w:t>
+      </w:r>
+    </w:p>
+    <w:p>
+      <w:pPr>
+        <w:pStyle w:val="Worksheet"/>
+      </w:pPr>
+      <w:r>
+        <w:rPr>
+          <w:rFonts w:ascii="Georgia" w:hAnsi="Georgia"/>
+          <w:b w:val="0"/>
+          <w:i w:val="0"/>
+        </w:rPr>
+        <w:t>________________________________________</w:t>
+      </w:r>
+    </w:p>
+    <w:p>
+      <w:pPr>
+        <w:pStyle w:val="Worksheet"/>
+      </w:pPr>
+      <w:r>
+        <w:rPr>
+          <w:rFonts w:ascii="Georgia" w:hAnsi="Georgia"/>
+          <w:b w:val="0"/>
+          <w:i w:val="0"/>
+        </w:rPr>
+        <w:t>________________________________________</w:t>
+      </w:r>
+    </w:p>
+    <w:p>
+      <w:pPr>
+        <w:pStyle w:val="Worksheet"/>
+      </w:pPr>
+      <w:r>
+        <w:rPr>
+          <w:rFonts w:ascii="Georgia" w:hAnsi="Georgia"/>
+          <w:b w:val="0"/>
+          <w:i w:val="0"/>
+        </w:rPr>
+        <w:t>________________________________________</w:t>
+      </w:r>
+    </w:p>
+    <w:p>
+      <w:pPr>
+        <w:pStyle w:val="Worksheet"/>
+      </w:pPr>
+      <w:r>
+        <w:rPr>
+          <w:rFonts w:ascii="Georgia" w:hAnsi="Georgia"/>
+          <w:b w:val="0"/>
+          <w:i w:val="0"/>
+        </w:rPr>
+        <w:t>________________________________________</w:t>
+      </w:r>
+    </w:p>
+    <w:p>
+      <w:pPr>
+        <w:pStyle w:val="Worksheet"/>
+      </w:pPr>
+      <w:r>
+        <w:rPr>
+          <w:rFonts w:ascii="Georgia" w:hAnsi="Georgia"/>
+          <w:b w:val="0"/>
+          <w:i w:val="0"/>
+        </w:rPr>
+        <w:t>________________________________________</w:t>
+      </w:r>
+    </w:p>
+    <w:p>
+      <w:pPr>
+        <w:pStyle w:val="Worksheet"/>
+      </w:pPr>
+      <w:r>
+        <w:rPr>
+          <w:rFonts w:ascii="Georgia" w:hAnsi="Georgia"/>
+          <w:b w:val="0"/>
+          <w:i w:val="0"/>
+        </w:rPr>
+        <w:t>________________________________________</w:t>
+      </w:r>
+    </w:p>
+    <w:p>
+      <w:pPr>
+        <w:pStyle w:val="Worksheet"/>
+      </w:pPr>
+      <w:r>
+        <w:rPr>
+          <w:rFonts w:ascii="Georgia" w:hAnsi="Georgia"/>
+          <w:b w:val="0"/>
+          <w:i w:val="0"/>
+        </w:rPr>
+        <w:t>________________________________________</w:t>
+      </w:r>
+    </w:p>
+    <w:p>
+      <w:r>
+        <w:br w:type="page"/>
+      </w:r>
+    </w:p>
+    <w:p>
+      <w:pPr>
         <w:spacing w:before="0" w:after="0" w:lineRule="exact" w:line="4320"/>
       </w:pPr>
       <w:r>
@@ -4181,6 +4639,219 @@
     </w:p>
     <w:p>
       <w:pPr>
+        <w:pStyle w:val="Heading2"/>
+      </w:pPr>
+      <w:r>
+        <w:rPr>
+          <w:rFonts w:ascii="Georgia" w:hAnsi="Georgia"/>
+          <w:b w:val="0"/>
+          <w:i w:val="0"/>
+        </w:rPr>
+        <w:t>Mis notas</w:t>
+      </w:r>
+    </w:p>
+    <w:p>
+      <w:pPr>
+        <w:pStyle w:val="Worksheet"/>
+      </w:pPr>
+      <w:r>
+        <w:rPr>
+          <w:rFonts w:ascii="Georgia" w:hAnsi="Georgia"/>
+          <w:b w:val="0"/>
+          <w:i w:val="0"/>
+        </w:rPr>
+        <w:t>________________________________________</w:t>
+      </w:r>
+    </w:p>
+    <w:p>
+      <w:pPr>
+        <w:pStyle w:val="Worksheet"/>
+      </w:pPr>
+      <w:r>
+        <w:rPr>
+          <w:rFonts w:ascii="Georgia" w:hAnsi="Georgia"/>
+          <w:b w:val="0"/>
+          <w:i w:val="0"/>
+        </w:rPr>
+        <w:t>________________________________________</w:t>
+      </w:r>
+    </w:p>
+    <w:p>
+      <w:pPr>
+        <w:pStyle w:val="Worksheet"/>
+      </w:pPr>
+      <w:r>
+        <w:rPr>
+          <w:rFonts w:ascii="Georgia" w:hAnsi="Georgia"/>
+          <w:b w:val="0"/>
+          <w:i w:val="0"/>
+        </w:rPr>
+        <w:t>________________________________________</w:t>
+      </w:r>
+    </w:p>
+    <w:p>
+      <w:pPr>
+        <w:pStyle w:val="Worksheet"/>
+      </w:pPr>
+      <w:r>
+        <w:rPr>
+          <w:rFonts w:ascii="Georgia" w:hAnsi="Georgia"/>
+          <w:b w:val="0"/>
+          <w:i w:val="0"/>
+        </w:rPr>
+        <w:t>________________________________________</w:t>
+      </w:r>
+    </w:p>
+    <w:p>
+      <w:pPr>
+        <w:pStyle w:val="Worksheet"/>
+      </w:pPr>
+      <w:r>
+        <w:rPr>
+          <w:rFonts w:ascii="Georgia" w:hAnsi="Georgia"/>
+          <w:b w:val="0"/>
+          <w:i w:val="0"/>
+        </w:rPr>
+        <w:t>________________________________________</w:t>
+      </w:r>
+    </w:p>
+    <w:p>
+      <w:pPr>
+        <w:pStyle w:val="Worksheet"/>
+      </w:pPr>
+      <w:r>
+        <w:rPr>
+          <w:rFonts w:ascii="Georgia" w:hAnsi="Georgia"/>
+          <w:b w:val="0"/>
+          <w:i w:val="0"/>
+        </w:rPr>
+        <w:t>________________________________________</w:t>
+      </w:r>
+    </w:p>
+    <w:p>
+      <w:pPr>
+        <w:pStyle w:val="Worksheet"/>
+      </w:pPr>
+      <w:r>
+        <w:rPr>
+          <w:rFonts w:ascii="Georgia" w:hAnsi="Georgia"/>
+          <w:b w:val="0"/>
+          <w:i w:val="0"/>
+        </w:rPr>
+        <w:t>________________________________________</w:t>
+      </w:r>
+    </w:p>
+    <w:p>
+      <w:pPr>
+        <w:pStyle w:val="Worksheet"/>
+      </w:pPr>
+      <w:r>
+        <w:rPr>
+          <w:rFonts w:ascii="Georgia" w:hAnsi="Georgia"/>
+          <w:b w:val="0"/>
+          <w:i w:val="0"/>
+        </w:rPr>
+        <w:t>________________________________________</w:t>
+      </w:r>
+    </w:p>
+    <w:p>
+      <w:pPr>
+        <w:pStyle w:val="Worksheet"/>
+      </w:pPr>
+      <w:r>
+        <w:rPr>
+          <w:rFonts w:ascii="Georgia" w:hAnsi="Georgia"/>
+          <w:b w:val="0"/>
+          <w:i w:val="0"/>
+        </w:rPr>
+        <w:t>________________________________________</w:t>
+      </w:r>
+    </w:p>
+    <w:p>
+      <w:pPr>
+        <w:pStyle w:val="Worksheet"/>
+      </w:pPr>
+      <w:r>
+        <w:rPr>
+          <w:rFonts w:ascii="Georgia" w:hAnsi="Georgia"/>
+          <w:b w:val="0"/>
+          <w:i w:val="0"/>
+        </w:rPr>
+        <w:t>________________________________________</w:t>
+      </w:r>
+    </w:p>
+    <w:p>
+      <w:pPr>
+        <w:pStyle w:val="Worksheet"/>
+      </w:pPr>
+      <w:r>
+        <w:rPr>
+          <w:rFonts w:ascii="Georgia" w:hAnsi="Georgia"/>
+          <w:b w:val="0"/>
+          <w:i w:val="0"/>
+        </w:rPr>
+        <w:t>________________________________________</w:t>
+      </w:r>
+    </w:p>
+    <w:p>
+      <w:pPr>
+        <w:pStyle w:val="Worksheet"/>
+      </w:pPr>
+      <w:r>
+        <w:rPr>
+          <w:rFonts w:ascii="Georgia" w:hAnsi="Georgia"/>
+          <w:b w:val="0"/>
+          <w:i w:val="0"/>
+        </w:rPr>
+        <w:t>________________________________________</w:t>
+      </w:r>
+    </w:p>
+    <w:p>
+      <w:pPr>
+        <w:pStyle w:val="Worksheet"/>
+      </w:pPr>
+      <w:r>
+        <w:rPr>
+          <w:rFonts w:ascii="Georgia" w:hAnsi="Georgia"/>
+          <w:b w:val="0"/>
+          <w:i w:val="0"/>
+        </w:rPr>
+        <w:t>________________________________________</w:t>
+      </w:r>
+    </w:p>
+    <w:p>
+      <w:pPr>
+        <w:pStyle w:val="Worksheet"/>
+      </w:pPr>
+      <w:r>
+        <w:rPr>
+          <w:rFonts w:ascii="Georgia" w:hAnsi="Georgia"/>
+          <w:b w:val="0"/>
+          <w:i w:val="0"/>
+        </w:rPr>
+        <w:t>________________________________________</w:t>
+      </w:r>
+    </w:p>
+    <w:p>
+      <w:pPr>
+        <w:pStyle w:val="Worksheet"/>
+      </w:pPr>
+      <w:r>
+        <w:rPr>
+          <w:rFonts w:ascii="Georgia" w:hAnsi="Georgia"/>
+          <w:b w:val="0"/>
+          <w:i w:val="0"/>
+        </w:rPr>
+        <w:t>________________________________________</w:t>
+      </w:r>
+    </w:p>
+    <w:p>
+      <w:r>
+        <w:br w:type="page"/>
+      </w:r>
+    </w:p>
+    <w:p>
+      <w:pPr>
         <w:spacing w:before="0" w:after="0" w:lineRule="exact" w:line="4320"/>
       </w:pPr>
       <w:r>
@@ -5937,6 +6608,219 @@
     </w:p>
     <w:p>
       <w:pPr>
+        <w:pStyle w:val="Heading2"/>
+      </w:pPr>
+      <w:r>
+        <w:rPr>
+          <w:rFonts w:ascii="Georgia" w:hAnsi="Georgia"/>
+          <w:b w:val="0"/>
+          <w:i w:val="0"/>
+        </w:rPr>
+        <w:t>Mis notas</w:t>
+      </w:r>
+    </w:p>
+    <w:p>
+      <w:pPr>
+        <w:pStyle w:val="Worksheet"/>
+      </w:pPr>
+      <w:r>
+        <w:rPr>
+          <w:rFonts w:ascii="Georgia" w:hAnsi="Georgia"/>
+          <w:b w:val="0"/>
+          <w:i w:val="0"/>
+        </w:rPr>
+        <w:t>________________________________________</w:t>
+      </w:r>
+    </w:p>
+    <w:p>
+      <w:pPr>
+        <w:pStyle w:val="Worksheet"/>
+      </w:pPr>
+      <w:r>
+        <w:rPr>
+          <w:rFonts w:ascii="Georgia" w:hAnsi="Georgia"/>
+          <w:b w:val="0"/>
+          <w:i w:val="0"/>
+        </w:rPr>
+        <w:t>________________________________________</w:t>
+      </w:r>
+    </w:p>
+    <w:p>
+      <w:pPr>
+        <w:pStyle w:val="Worksheet"/>
+      </w:pPr>
+      <w:r>
+        <w:rPr>
+          <w:rFonts w:ascii="Georgia" w:hAnsi="Georgia"/>
+          <w:b w:val="0"/>
+          <w:i w:val="0"/>
+        </w:rPr>
+        <w:t>________________________________________</w:t>
+      </w:r>
+    </w:p>
+    <w:p>
+      <w:pPr>
+        <w:pStyle w:val="Worksheet"/>
+      </w:pPr>
+      <w:r>
+        <w:rPr>
+          <w:rFonts w:ascii="Georgia" w:hAnsi="Georgia"/>
+          <w:b w:val="0"/>
+          <w:i w:val="0"/>
+        </w:rPr>
+        <w:t>________________________________________</w:t>
+      </w:r>
+    </w:p>
+    <w:p>
+      <w:pPr>
+        <w:pStyle w:val="Worksheet"/>
+      </w:pPr>
+      <w:r>
+        <w:rPr>
+          <w:rFonts w:ascii="Georgia" w:hAnsi="Georgia"/>
+          <w:b w:val="0"/>
+          <w:i w:val="0"/>
+        </w:rPr>
+        <w:t>________________________________________</w:t>
+      </w:r>
+    </w:p>
+    <w:p>
+      <w:pPr>
+        <w:pStyle w:val="Worksheet"/>
+      </w:pPr>
+      <w:r>
+        <w:rPr>
+          <w:rFonts w:ascii="Georgia" w:hAnsi="Georgia"/>
+          <w:b w:val="0"/>
+          <w:i w:val="0"/>
+        </w:rPr>
+        <w:t>________________________________________</w:t>
+      </w:r>
+    </w:p>
+    <w:p>
+      <w:pPr>
+        <w:pStyle w:val="Worksheet"/>
+      </w:pPr>
+      <w:r>
+        <w:rPr>
+          <w:rFonts w:ascii="Georgia" w:hAnsi="Georgia"/>
+          <w:b w:val="0"/>
+          <w:i w:val="0"/>
+        </w:rPr>
+        <w:t>________________________________________</w:t>
+      </w:r>
+    </w:p>
+    <w:p>
+      <w:pPr>
+        <w:pStyle w:val="Worksheet"/>
+      </w:pPr>
+      <w:r>
+        <w:rPr>
+          <w:rFonts w:ascii="Georgia" w:hAnsi="Georgia"/>
+          <w:b w:val="0"/>
+          <w:i w:val="0"/>
+        </w:rPr>
+        <w:t>________________________________________</w:t>
+      </w:r>
+    </w:p>
+    <w:p>
+      <w:pPr>
+        <w:pStyle w:val="Worksheet"/>
+      </w:pPr>
+      <w:r>
+        <w:rPr>
+          <w:rFonts w:ascii="Georgia" w:hAnsi="Georgia"/>
+          <w:b w:val="0"/>
+          <w:i w:val="0"/>
+        </w:rPr>
+        <w:t>________________________________________</w:t>
+      </w:r>
+    </w:p>
+    <w:p>
+      <w:pPr>
+        <w:pStyle w:val="Worksheet"/>
+      </w:pPr>
+      <w:r>
+        <w:rPr>
+          <w:rFonts w:ascii="Georgia" w:hAnsi="Georgia"/>
+          <w:b w:val="0"/>
+          <w:i w:val="0"/>
+        </w:rPr>
+        <w:t>________________________________________</w:t>
+      </w:r>
+    </w:p>
+    <w:p>
+      <w:pPr>
+        <w:pStyle w:val="Worksheet"/>
+      </w:pPr>
+      <w:r>
+        <w:rPr>
+          <w:rFonts w:ascii="Georgia" w:hAnsi="Georgia"/>
+          <w:b w:val="0"/>
+          <w:i w:val="0"/>
+        </w:rPr>
+        <w:t>________________________________________</w:t>
+      </w:r>
+    </w:p>
+    <w:p>
+      <w:pPr>
+        <w:pStyle w:val="Worksheet"/>
+      </w:pPr>
+      <w:r>
+        <w:rPr>
+          <w:rFonts w:ascii="Georgia" w:hAnsi="Georgia"/>
+          <w:b w:val="0"/>
+          <w:i w:val="0"/>
+        </w:rPr>
+        <w:t>________________________________________</w:t>
+      </w:r>
+    </w:p>
+    <w:p>
+      <w:pPr>
+        <w:pStyle w:val="Worksheet"/>
+      </w:pPr>
+      <w:r>
+        <w:rPr>
+          <w:rFonts w:ascii="Georgia" w:hAnsi="Georgia"/>
+          <w:b w:val="0"/>
+          <w:i w:val="0"/>
+        </w:rPr>
+        <w:t>________________________________________</w:t>
+      </w:r>
+    </w:p>
+    <w:p>
+      <w:pPr>
+        <w:pStyle w:val="Worksheet"/>
+      </w:pPr>
+      <w:r>
+        <w:rPr>
+          <w:rFonts w:ascii="Georgia" w:hAnsi="Georgia"/>
+          <w:b w:val="0"/>
+          <w:i w:val="0"/>
+        </w:rPr>
+        <w:t>________________________________________</w:t>
+      </w:r>
+    </w:p>
+    <w:p>
+      <w:pPr>
+        <w:pStyle w:val="Worksheet"/>
+      </w:pPr>
+      <w:r>
+        <w:rPr>
+          <w:rFonts w:ascii="Georgia" w:hAnsi="Georgia"/>
+          <w:b w:val="0"/>
+          <w:i w:val="0"/>
+        </w:rPr>
+        <w:t>________________________________________</w:t>
+      </w:r>
+    </w:p>
+    <w:p>
+      <w:r>
+        <w:br w:type="page"/>
+      </w:r>
+    </w:p>
+    <w:p>
+      <w:pPr>
         <w:spacing w:before="0" w:after="0" w:lineRule="exact" w:line="4320"/>
       </w:pPr>
       <w:r>
@@ -6321,6 +7205,19 @@
           <w:b w:val="0"/>
           <w:i/>
         </w:rPr>
+        <w:t>No todos los silencios están vacíos.</w:t>
+      </w:r>
+    </w:p>
+    <w:p>
+      <w:pPr>
+        <w:pStyle w:val="BlockQuote"/>
+      </w:pPr>
+      <w:r>
+        <w:rPr>
+          <w:rFonts w:ascii="Georgia" w:hAnsi="Georgia"/>
+          <w:b w:val="0"/>
+          <w:i/>
+        </w:rPr>
         <w:t>No tienes que contarme nada que no quieras. Puedo quedarme aquí un rato.</w:t>
       </w:r>
     </w:p>
@@ -6554,6 +7451,19 @@
           <w:i w:val="0"/>
         </w:rPr>
         <w:t>Ayuda práctica</w:t>
+      </w:r>
+    </w:p>
+    <w:p>
+      <w:pPr>
+        <w:pStyle w:val="BlockQuote"/>
+      </w:pPr>
+      <w:r>
+        <w:rPr>
+          <w:rFonts w:ascii="Georgia" w:hAnsi="Georgia"/>
+          <w:b w:val="0"/>
+          <w:i/>
+        </w:rPr>
+        <w:t>En medio del caos, encontrar a otro es una forma de encontrarse.</w:t>
       </w:r>
     </w:p>
     <w:p>
@@ -7694,6 +8604,219 @@
     </w:p>
     <w:p>
       <w:pPr>
+        <w:pStyle w:val="Heading2"/>
+      </w:pPr>
+      <w:r>
+        <w:rPr>
+          <w:rFonts w:ascii="Georgia" w:hAnsi="Georgia"/>
+          <w:b w:val="0"/>
+          <w:i w:val="0"/>
+        </w:rPr>
+        <w:t>Mis notas</w:t>
+      </w:r>
+    </w:p>
+    <w:p>
+      <w:pPr>
+        <w:pStyle w:val="Worksheet"/>
+      </w:pPr>
+      <w:r>
+        <w:rPr>
+          <w:rFonts w:ascii="Georgia" w:hAnsi="Georgia"/>
+          <w:b w:val="0"/>
+          <w:i w:val="0"/>
+        </w:rPr>
+        <w:t>________________________________________</w:t>
+      </w:r>
+    </w:p>
+    <w:p>
+      <w:pPr>
+        <w:pStyle w:val="Worksheet"/>
+      </w:pPr>
+      <w:r>
+        <w:rPr>
+          <w:rFonts w:ascii="Georgia" w:hAnsi="Georgia"/>
+          <w:b w:val="0"/>
+          <w:i w:val="0"/>
+        </w:rPr>
+        <w:t>________________________________________</w:t>
+      </w:r>
+    </w:p>
+    <w:p>
+      <w:pPr>
+        <w:pStyle w:val="Worksheet"/>
+      </w:pPr>
+      <w:r>
+        <w:rPr>
+          <w:rFonts w:ascii="Georgia" w:hAnsi="Georgia"/>
+          <w:b w:val="0"/>
+          <w:i w:val="0"/>
+        </w:rPr>
+        <w:t>________________________________________</w:t>
+      </w:r>
+    </w:p>
+    <w:p>
+      <w:pPr>
+        <w:pStyle w:val="Worksheet"/>
+      </w:pPr>
+      <w:r>
+        <w:rPr>
+          <w:rFonts w:ascii="Georgia" w:hAnsi="Georgia"/>
+          <w:b w:val="0"/>
+          <w:i w:val="0"/>
+        </w:rPr>
+        <w:t>________________________________________</w:t>
+      </w:r>
+    </w:p>
+    <w:p>
+      <w:pPr>
+        <w:pStyle w:val="Worksheet"/>
+      </w:pPr>
+      <w:r>
+        <w:rPr>
+          <w:rFonts w:ascii="Georgia" w:hAnsi="Georgia"/>
+          <w:b w:val="0"/>
+          <w:i w:val="0"/>
+        </w:rPr>
+        <w:t>________________________________________</w:t>
+      </w:r>
+    </w:p>
+    <w:p>
+      <w:pPr>
+        <w:pStyle w:val="Worksheet"/>
+      </w:pPr>
+      <w:r>
+        <w:rPr>
+          <w:rFonts w:ascii="Georgia" w:hAnsi="Georgia"/>
+          <w:b w:val="0"/>
+          <w:i w:val="0"/>
+        </w:rPr>
+        <w:t>________________________________________</w:t>
+      </w:r>
+    </w:p>
+    <w:p>
+      <w:pPr>
+        <w:pStyle w:val="Worksheet"/>
+      </w:pPr>
+      <w:r>
+        <w:rPr>
+          <w:rFonts w:ascii="Georgia" w:hAnsi="Georgia"/>
+          <w:b w:val="0"/>
+          <w:i w:val="0"/>
+        </w:rPr>
+        <w:t>________________________________________</w:t>
+      </w:r>
+    </w:p>
+    <w:p>
+      <w:pPr>
+        <w:pStyle w:val="Worksheet"/>
+      </w:pPr>
+      <w:r>
+        <w:rPr>
+          <w:rFonts w:ascii="Georgia" w:hAnsi="Georgia"/>
+          <w:b w:val="0"/>
+          <w:i w:val="0"/>
+        </w:rPr>
+        <w:t>________________________________________</w:t>
+      </w:r>
+    </w:p>
+    <w:p>
+      <w:pPr>
+        <w:pStyle w:val="Worksheet"/>
+      </w:pPr>
+      <w:r>
+        <w:rPr>
+          <w:rFonts w:ascii="Georgia" w:hAnsi="Georgia"/>
+          <w:b w:val="0"/>
+          <w:i w:val="0"/>
+        </w:rPr>
+        <w:t>________________________________________</w:t>
+      </w:r>
+    </w:p>
+    <w:p>
+      <w:pPr>
+        <w:pStyle w:val="Worksheet"/>
+      </w:pPr>
+      <w:r>
+        <w:rPr>
+          <w:rFonts w:ascii="Georgia" w:hAnsi="Georgia"/>
+          <w:b w:val="0"/>
+          <w:i w:val="0"/>
+        </w:rPr>
+        <w:t>________________________________________</w:t>
+      </w:r>
+    </w:p>
+    <w:p>
+      <w:pPr>
+        <w:pStyle w:val="Worksheet"/>
+      </w:pPr>
+      <w:r>
+        <w:rPr>
+          <w:rFonts w:ascii="Georgia" w:hAnsi="Georgia"/>
+          <w:b w:val="0"/>
+          <w:i w:val="0"/>
+        </w:rPr>
+        <w:t>________________________________________</w:t>
+      </w:r>
+    </w:p>
+    <w:p>
+      <w:pPr>
+        <w:pStyle w:val="Worksheet"/>
+      </w:pPr>
+      <w:r>
+        <w:rPr>
+          <w:rFonts w:ascii="Georgia" w:hAnsi="Georgia"/>
+          <w:b w:val="0"/>
+          <w:i w:val="0"/>
+        </w:rPr>
+        <w:t>________________________________________</w:t>
+      </w:r>
+    </w:p>
+    <w:p>
+      <w:pPr>
+        <w:pStyle w:val="Worksheet"/>
+      </w:pPr>
+      <w:r>
+        <w:rPr>
+          <w:rFonts w:ascii="Georgia" w:hAnsi="Georgia"/>
+          <w:b w:val="0"/>
+          <w:i w:val="0"/>
+        </w:rPr>
+        <w:t>________________________________________</w:t>
+      </w:r>
+    </w:p>
+    <w:p>
+      <w:pPr>
+        <w:pStyle w:val="Worksheet"/>
+      </w:pPr>
+      <w:r>
+        <w:rPr>
+          <w:rFonts w:ascii="Georgia" w:hAnsi="Georgia"/>
+          <w:b w:val="0"/>
+          <w:i w:val="0"/>
+        </w:rPr>
+        <w:t>________________________________________</w:t>
+      </w:r>
+    </w:p>
+    <w:p>
+      <w:pPr>
+        <w:pStyle w:val="Worksheet"/>
+      </w:pPr>
+      <w:r>
+        <w:rPr>
+          <w:rFonts w:ascii="Georgia" w:hAnsi="Georgia"/>
+          <w:b w:val="0"/>
+          <w:i w:val="0"/>
+        </w:rPr>
+        <w:t>________________________________________</w:t>
+      </w:r>
+    </w:p>
+    <w:p>
+      <w:r>
+        <w:br w:type="page"/>
+      </w:r>
+    </w:p>
+    <w:p>
+      <w:pPr>
         <w:spacing w:before="0" w:after="0" w:lineRule="exact" w:line="4320"/>
       </w:pPr>
       <w:r>
@@ -8029,6 +9152,41 @@
       </w:r>
     </w:p>
     <w:p>
+      <w:pPr/>
+      <w:r>
+        <w:rPr>
+          <w:rFonts w:ascii="Georgia" w:hAnsi="Georgia"/>
+          <w:b w:val="0"/>
+          <w:i w:val="0"/>
+        </w:rPr>
+        <w:t>Una conversación real puede avanzar por preguntas muy concretas. No hace falta responderlas todas de una vez ni encontrar palabras perfectas. Por ejemplo:</w:t>
+      </w:r>
+    </w:p>
+    <w:p>
+      <w:pPr>
+        <w:pStyle w:val="BlockQuote"/>
+      </w:pPr>
+      <w:r>
+        <w:rPr>
+          <w:rFonts w:ascii="Georgia" w:hAnsi="Georgia"/>
+          <w:b w:val="0"/>
+          <w:i/>
+        </w:rPr>
+        <w:t>—¿Voy a volver a ver a mamá? —No podremos verla físicamente como antes, porque murió. Podemos seguir recordándola, mirar sus fotos y hablar de ella. —¿Está en el cielo? —Cada familia tiene sus propias creencias. Nosotros creemos que está en el cielo. Lo que sabemos con seguridad es que su cuerpo dejó de funcionar y que no va a volver. —¿Y quién me va a cuidar? —Yo voy a estar contigo. También estarán la abuela y el tío. Te iremos contando qué va a pasar.</w:t>
+      </w:r>
+    </w:p>
+    <w:p>
+      <w:pPr/>
+      <w:r>
+        <w:rPr>
+          <w:rFonts w:ascii="Georgia" w:hAnsi="Georgia"/>
+          <w:b w:val="0"/>
+          <w:i w:val="0"/>
+        </w:rPr>
+        <w:t>Adapta la relación familiar —mamá, papá, hermano, hermana, abuelo u otra persona querida— y la explicación espiritual a las creencias de la familia. No presentes una creencia como un hecho comprobable ni uses el cielo para evitar decir que la persona murió. Responde solo a lo que el niño pregunta, comprueba qué entendió y permite que vuelva a preguntar otro día.</w:t>
+      </w:r>
+    </w:p>
+    <w:p>
       <w:pPr>
         <w:pStyle w:val="Heading2"/>
       </w:pPr>
@@ -8334,7 +9492,7 @@
           <w:b w:val="0"/>
           <w:i w:val="0"/>
         </w:rPr>
-        <w:t>El juego no significa que olvidaron</w:t>
+        <w:t>El juego es el lenguaje de los niños</w:t>
       </w:r>
     </w:p>
     <w:p>
@@ -8345,7 +9503,7 @@
           <w:b w:val="0"/>
           <w:i w:val="0"/>
         </w:rPr>
-        <w:t>Un niño puede llorar y diez minutos después jugar. Esa oscilación es saludable. El juego permite regularse y representar lo que no puede explicar.</w:t>
+        <w:t>Un niño puede llorar y diez minutos después jugar. Esa oscilación es saludable. El juego no significa que haya olvidado: es uno de sus principales lenguajes. Le permite regularse y representar lo que todavía no puede explicar con palabras.</w:t>
       </w:r>
     </w:p>
     <w:p>
@@ -9006,6 +10164,219 @@
     </w:p>
     <w:p>
       <w:pPr>
+        <w:pStyle w:val="Heading2"/>
+      </w:pPr>
+      <w:r>
+        <w:rPr>
+          <w:rFonts w:ascii="Georgia" w:hAnsi="Georgia"/>
+          <w:b w:val="0"/>
+          <w:i w:val="0"/>
+        </w:rPr>
+        <w:t>Mis notas</w:t>
+      </w:r>
+    </w:p>
+    <w:p>
+      <w:pPr>
+        <w:pStyle w:val="Worksheet"/>
+      </w:pPr>
+      <w:r>
+        <w:rPr>
+          <w:rFonts w:ascii="Georgia" w:hAnsi="Georgia"/>
+          <w:b w:val="0"/>
+          <w:i w:val="0"/>
+        </w:rPr>
+        <w:t>________________________________________</w:t>
+      </w:r>
+    </w:p>
+    <w:p>
+      <w:pPr>
+        <w:pStyle w:val="Worksheet"/>
+      </w:pPr>
+      <w:r>
+        <w:rPr>
+          <w:rFonts w:ascii="Georgia" w:hAnsi="Georgia"/>
+          <w:b w:val="0"/>
+          <w:i w:val="0"/>
+        </w:rPr>
+        <w:t>________________________________________</w:t>
+      </w:r>
+    </w:p>
+    <w:p>
+      <w:pPr>
+        <w:pStyle w:val="Worksheet"/>
+      </w:pPr>
+      <w:r>
+        <w:rPr>
+          <w:rFonts w:ascii="Georgia" w:hAnsi="Georgia"/>
+          <w:b w:val="0"/>
+          <w:i w:val="0"/>
+        </w:rPr>
+        <w:t>________________________________________</w:t>
+      </w:r>
+    </w:p>
+    <w:p>
+      <w:pPr>
+        <w:pStyle w:val="Worksheet"/>
+      </w:pPr>
+      <w:r>
+        <w:rPr>
+          <w:rFonts w:ascii="Georgia" w:hAnsi="Georgia"/>
+          <w:b w:val="0"/>
+          <w:i w:val="0"/>
+        </w:rPr>
+        <w:t>________________________________________</w:t>
+      </w:r>
+    </w:p>
+    <w:p>
+      <w:pPr>
+        <w:pStyle w:val="Worksheet"/>
+      </w:pPr>
+      <w:r>
+        <w:rPr>
+          <w:rFonts w:ascii="Georgia" w:hAnsi="Georgia"/>
+          <w:b w:val="0"/>
+          <w:i w:val="0"/>
+        </w:rPr>
+        <w:t>________________________________________</w:t>
+      </w:r>
+    </w:p>
+    <w:p>
+      <w:pPr>
+        <w:pStyle w:val="Worksheet"/>
+      </w:pPr>
+      <w:r>
+        <w:rPr>
+          <w:rFonts w:ascii="Georgia" w:hAnsi="Georgia"/>
+          <w:b w:val="0"/>
+          <w:i w:val="0"/>
+        </w:rPr>
+        <w:t>________________________________________</w:t>
+      </w:r>
+    </w:p>
+    <w:p>
+      <w:pPr>
+        <w:pStyle w:val="Worksheet"/>
+      </w:pPr>
+      <w:r>
+        <w:rPr>
+          <w:rFonts w:ascii="Georgia" w:hAnsi="Georgia"/>
+          <w:b w:val="0"/>
+          <w:i w:val="0"/>
+        </w:rPr>
+        <w:t>________________________________________</w:t>
+      </w:r>
+    </w:p>
+    <w:p>
+      <w:pPr>
+        <w:pStyle w:val="Worksheet"/>
+      </w:pPr>
+      <w:r>
+        <w:rPr>
+          <w:rFonts w:ascii="Georgia" w:hAnsi="Georgia"/>
+          <w:b w:val="0"/>
+          <w:i w:val="0"/>
+        </w:rPr>
+        <w:t>________________________________________</w:t>
+      </w:r>
+    </w:p>
+    <w:p>
+      <w:pPr>
+        <w:pStyle w:val="Worksheet"/>
+      </w:pPr>
+      <w:r>
+        <w:rPr>
+          <w:rFonts w:ascii="Georgia" w:hAnsi="Georgia"/>
+          <w:b w:val="0"/>
+          <w:i w:val="0"/>
+        </w:rPr>
+        <w:t>________________________________________</w:t>
+      </w:r>
+    </w:p>
+    <w:p>
+      <w:pPr>
+        <w:pStyle w:val="Worksheet"/>
+      </w:pPr>
+      <w:r>
+        <w:rPr>
+          <w:rFonts w:ascii="Georgia" w:hAnsi="Georgia"/>
+          <w:b w:val="0"/>
+          <w:i w:val="0"/>
+        </w:rPr>
+        <w:t>________________________________________</w:t>
+      </w:r>
+    </w:p>
+    <w:p>
+      <w:pPr>
+        <w:pStyle w:val="Worksheet"/>
+      </w:pPr>
+      <w:r>
+        <w:rPr>
+          <w:rFonts w:ascii="Georgia" w:hAnsi="Georgia"/>
+          <w:b w:val="0"/>
+          <w:i w:val="0"/>
+        </w:rPr>
+        <w:t>________________________________________</w:t>
+      </w:r>
+    </w:p>
+    <w:p>
+      <w:pPr>
+        <w:pStyle w:val="Worksheet"/>
+      </w:pPr>
+      <w:r>
+        <w:rPr>
+          <w:rFonts w:ascii="Georgia" w:hAnsi="Georgia"/>
+          <w:b w:val="0"/>
+          <w:i w:val="0"/>
+        </w:rPr>
+        <w:t>________________________________________</w:t>
+      </w:r>
+    </w:p>
+    <w:p>
+      <w:pPr>
+        <w:pStyle w:val="Worksheet"/>
+      </w:pPr>
+      <w:r>
+        <w:rPr>
+          <w:rFonts w:ascii="Georgia" w:hAnsi="Georgia"/>
+          <w:b w:val="0"/>
+          <w:i w:val="0"/>
+        </w:rPr>
+        <w:t>________________________________________</w:t>
+      </w:r>
+    </w:p>
+    <w:p>
+      <w:pPr>
+        <w:pStyle w:val="Worksheet"/>
+      </w:pPr>
+      <w:r>
+        <w:rPr>
+          <w:rFonts w:ascii="Georgia" w:hAnsi="Georgia"/>
+          <w:b w:val="0"/>
+          <w:i w:val="0"/>
+        </w:rPr>
+        <w:t>________________________________________</w:t>
+      </w:r>
+    </w:p>
+    <w:p>
+      <w:pPr>
+        <w:pStyle w:val="Worksheet"/>
+      </w:pPr>
+      <w:r>
+        <w:rPr>
+          <w:rFonts w:ascii="Georgia" w:hAnsi="Georgia"/>
+          <w:b w:val="0"/>
+          <w:i w:val="0"/>
+        </w:rPr>
+        <w:t>________________________________________</w:t>
+      </w:r>
+    </w:p>
+    <w:p>
+      <w:r>
+        <w:br w:type="page"/>
+      </w:r>
+    </w:p>
+    <w:p>
+      <w:pPr>
         <w:spacing w:before="0" w:after="0" w:lineRule="exact" w:line="4320"/>
       </w:pPr>
       <w:r>
@@ -9064,6 +10435,19 @@
       </w:r>
     </w:p>
     <w:p>
+      <w:pPr>
+        <w:pStyle w:val="BlockQuote"/>
+      </w:pPr>
+      <w:r>
+        <w:rPr>
+          <w:rFonts w:ascii="Georgia" w:hAnsi="Georgia"/>
+          <w:b w:val="0"/>
+          <w:i/>
+        </w:rPr>
+        <w:t>Acompañar el sufrimiento ajeno no nos vuelve inmunes al propio.</w:t>
+      </w:r>
+    </w:p>
+    <w:p>
       <w:pPr/>
       <w:r>
         <w:rPr>
@@ -9459,6 +10843,32 @@
           <w:i w:val="0"/>
         </w:rPr>
         <w:t>Pedir un relevo es una decisión clínica y ética.</w:t>
+      </w:r>
+    </w:p>
+    <w:p>
+      <w:pPr>
+        <w:pStyle w:val="BlockQuote"/>
+      </w:pPr>
+      <w:r>
+        <w:rPr>
+          <w:rFonts w:ascii="Georgia" w:hAnsi="Georgia"/>
+          <w:b w:val="0"/>
+          <w:i/>
+        </w:rPr>
+        <w:t>No hay que ser invulnerable para poder convertirse en refugio.</w:t>
+      </w:r>
+    </w:p>
+    <w:p>
+      <w:pPr>
+        <w:pStyle w:val="BlockQuote"/>
+      </w:pPr>
+      <w:r>
+        <w:rPr>
+          <w:rFonts w:ascii="Georgia" w:hAnsi="Georgia"/>
+          <w:b w:val="0"/>
+          <w:i/>
+        </w:rPr>
+        <w:t>Quien contiene también necesita dónde poder desbordarse.</w:t>
       </w:r>
     </w:p>
     <w:p>
@@ -10164,6 +11574,219 @@
     </w:p>
     <w:p>
       <w:pPr>
+        <w:pStyle w:val="Heading2"/>
+      </w:pPr>
+      <w:r>
+        <w:rPr>
+          <w:rFonts w:ascii="Georgia" w:hAnsi="Georgia"/>
+          <w:b w:val="0"/>
+          <w:i w:val="0"/>
+        </w:rPr>
+        <w:t>Mis notas</w:t>
+      </w:r>
+    </w:p>
+    <w:p>
+      <w:pPr>
+        <w:pStyle w:val="Worksheet"/>
+      </w:pPr>
+      <w:r>
+        <w:rPr>
+          <w:rFonts w:ascii="Georgia" w:hAnsi="Georgia"/>
+          <w:b w:val="0"/>
+          <w:i w:val="0"/>
+        </w:rPr>
+        <w:t>________________________________________</w:t>
+      </w:r>
+    </w:p>
+    <w:p>
+      <w:pPr>
+        <w:pStyle w:val="Worksheet"/>
+      </w:pPr>
+      <w:r>
+        <w:rPr>
+          <w:rFonts w:ascii="Georgia" w:hAnsi="Georgia"/>
+          <w:b w:val="0"/>
+          <w:i w:val="0"/>
+        </w:rPr>
+        <w:t>________________________________________</w:t>
+      </w:r>
+    </w:p>
+    <w:p>
+      <w:pPr>
+        <w:pStyle w:val="Worksheet"/>
+      </w:pPr>
+      <w:r>
+        <w:rPr>
+          <w:rFonts w:ascii="Georgia" w:hAnsi="Georgia"/>
+          <w:b w:val="0"/>
+          <w:i w:val="0"/>
+        </w:rPr>
+        <w:t>________________________________________</w:t>
+      </w:r>
+    </w:p>
+    <w:p>
+      <w:pPr>
+        <w:pStyle w:val="Worksheet"/>
+      </w:pPr>
+      <w:r>
+        <w:rPr>
+          <w:rFonts w:ascii="Georgia" w:hAnsi="Georgia"/>
+          <w:b w:val="0"/>
+          <w:i w:val="0"/>
+        </w:rPr>
+        <w:t>________________________________________</w:t>
+      </w:r>
+    </w:p>
+    <w:p>
+      <w:pPr>
+        <w:pStyle w:val="Worksheet"/>
+      </w:pPr>
+      <w:r>
+        <w:rPr>
+          <w:rFonts w:ascii="Georgia" w:hAnsi="Georgia"/>
+          <w:b w:val="0"/>
+          <w:i w:val="0"/>
+        </w:rPr>
+        <w:t>________________________________________</w:t>
+      </w:r>
+    </w:p>
+    <w:p>
+      <w:pPr>
+        <w:pStyle w:val="Worksheet"/>
+      </w:pPr>
+      <w:r>
+        <w:rPr>
+          <w:rFonts w:ascii="Georgia" w:hAnsi="Georgia"/>
+          <w:b w:val="0"/>
+          <w:i w:val="0"/>
+        </w:rPr>
+        <w:t>________________________________________</w:t>
+      </w:r>
+    </w:p>
+    <w:p>
+      <w:pPr>
+        <w:pStyle w:val="Worksheet"/>
+      </w:pPr>
+      <w:r>
+        <w:rPr>
+          <w:rFonts w:ascii="Georgia" w:hAnsi="Georgia"/>
+          <w:b w:val="0"/>
+          <w:i w:val="0"/>
+        </w:rPr>
+        <w:t>________________________________________</w:t>
+      </w:r>
+    </w:p>
+    <w:p>
+      <w:pPr>
+        <w:pStyle w:val="Worksheet"/>
+      </w:pPr>
+      <w:r>
+        <w:rPr>
+          <w:rFonts w:ascii="Georgia" w:hAnsi="Georgia"/>
+          <w:b w:val="0"/>
+          <w:i w:val="0"/>
+        </w:rPr>
+        <w:t>________________________________________</w:t>
+      </w:r>
+    </w:p>
+    <w:p>
+      <w:pPr>
+        <w:pStyle w:val="Worksheet"/>
+      </w:pPr>
+      <w:r>
+        <w:rPr>
+          <w:rFonts w:ascii="Georgia" w:hAnsi="Georgia"/>
+          <w:b w:val="0"/>
+          <w:i w:val="0"/>
+        </w:rPr>
+        <w:t>________________________________________</w:t>
+      </w:r>
+    </w:p>
+    <w:p>
+      <w:pPr>
+        <w:pStyle w:val="Worksheet"/>
+      </w:pPr>
+      <w:r>
+        <w:rPr>
+          <w:rFonts w:ascii="Georgia" w:hAnsi="Georgia"/>
+          <w:b w:val="0"/>
+          <w:i w:val="0"/>
+        </w:rPr>
+        <w:t>________________________________________</w:t>
+      </w:r>
+    </w:p>
+    <w:p>
+      <w:pPr>
+        <w:pStyle w:val="Worksheet"/>
+      </w:pPr>
+      <w:r>
+        <w:rPr>
+          <w:rFonts w:ascii="Georgia" w:hAnsi="Georgia"/>
+          <w:b w:val="0"/>
+          <w:i w:val="0"/>
+        </w:rPr>
+        <w:t>________________________________________</w:t>
+      </w:r>
+    </w:p>
+    <w:p>
+      <w:pPr>
+        <w:pStyle w:val="Worksheet"/>
+      </w:pPr>
+      <w:r>
+        <w:rPr>
+          <w:rFonts w:ascii="Georgia" w:hAnsi="Georgia"/>
+          <w:b w:val="0"/>
+          <w:i w:val="0"/>
+        </w:rPr>
+        <w:t>________________________________________</w:t>
+      </w:r>
+    </w:p>
+    <w:p>
+      <w:pPr>
+        <w:pStyle w:val="Worksheet"/>
+      </w:pPr>
+      <w:r>
+        <w:rPr>
+          <w:rFonts w:ascii="Georgia" w:hAnsi="Georgia"/>
+          <w:b w:val="0"/>
+          <w:i w:val="0"/>
+        </w:rPr>
+        <w:t>________________________________________</w:t>
+      </w:r>
+    </w:p>
+    <w:p>
+      <w:pPr>
+        <w:pStyle w:val="Worksheet"/>
+      </w:pPr>
+      <w:r>
+        <w:rPr>
+          <w:rFonts w:ascii="Georgia" w:hAnsi="Georgia"/>
+          <w:b w:val="0"/>
+          <w:i w:val="0"/>
+        </w:rPr>
+        <w:t>________________________________________</w:t>
+      </w:r>
+    </w:p>
+    <w:p>
+      <w:pPr>
+        <w:pStyle w:val="Worksheet"/>
+      </w:pPr>
+      <w:r>
+        <w:rPr>
+          <w:rFonts w:ascii="Georgia" w:hAnsi="Georgia"/>
+          <w:b w:val="0"/>
+          <w:i w:val="0"/>
+        </w:rPr>
+        <w:t>________________________________________</w:t>
+      </w:r>
+    </w:p>
+    <w:p>
+      <w:r>
+        <w:br w:type="page"/>
+      </w:r>
+    </w:p>
+    <w:p>
+      <w:pPr>
         <w:spacing w:before="0" w:after="0" w:lineRule="exact" w:line="4320"/>
       </w:pPr>
       <w:r>
@@ -10379,7 +12002,7 @@
           <w:b w:val="0"/>
           <w:i w:val="0"/>
         </w:rPr>
-        <w:t>Recuperar agencia</w:t>
+        <w:t>Recuperar estructura y capacidad de coordinar</w:t>
       </w:r>
     </w:p>
     <w:p>
@@ -10390,7 +12013,7 @@
           <w:b w:val="0"/>
           <w:i w:val="0"/>
         </w:rPr>
-        <w:t>La catástrofe impone decisiones y quita control. La reconstrucción devuelve elecciones, incluso pequeñas.</w:t>
+        <w:t>La catástrofe desordena horarios, responsabilidades y decisiones, y quita sensación de control. La reconstrucción ayuda a recuperar estructura y formas sencillas de coordinar la vida cotidiana, incluso mediante elecciones pequeñas.</w:t>
       </w:r>
     </w:p>
     <w:p>
@@ -10480,7 +12103,7 @@
           <w:b w:val="0"/>
           <w:i w:val="0"/>
         </w:rPr>
-        <w:t>La agencia no es autosuficiencia. Incluye elegir recibir ayuda.</w:t>
+        <w:t>Recuperar estructura no significa hacerlo todo en solitario. También incluye repartir tareas, acordar prioridades y elegir recibir ayuda.</w:t>
       </w:r>
     </w:p>
     <w:p>
@@ -10668,6 +12291,17 @@
           <w:i w:val="0"/>
         </w:rPr>
         <w:t>Regresar a un edificio, una calle o una montaña puede activar la alarma. Antes de exponerte, confirma que el lugar fue evaluado y es seguro. La terapia no vuelve segura una estructura dañada.</w:t>
+      </w:r>
+    </w:p>
+    <w:p>
+      <w:pPr/>
+      <w:r>
+        <w:rPr>
+          <w:rFonts w:ascii="Georgia" w:hAnsi="Georgia"/>
+          <w:b w:val="0"/>
+          <w:i w:val="0"/>
+        </w:rPr>
+        <w:t>No entres en un edificio con escombros o daños estructurales, aunque dentro haya documentos, fotografías u otro objeto muy valioso. Pide ayuda a bomberos, protección civil o personal capacitado para valorar si es posible recuperarlo sin exponerte. Si la autoridad ha clausurado el lugar o indica que no se puede entrar, respeta esa decisión. Entrar “solo un momento” o “muy rápido” también puede acabar en una lesión grave o una nueva pérdida.</w:t>
       </w:r>
     </w:p>
     <w:p>
@@ -10779,6 +12413,19 @@
     </w:p>
     <w:p>
       <w:pPr>
+        <w:pStyle w:val="BlockQuote"/>
+      </w:pPr>
+      <w:r>
+        <w:rPr>
+          <w:rFonts w:ascii="Georgia" w:hAnsi="Georgia"/>
+          <w:b w:val="0"/>
+          <w:i/>
+        </w:rPr>
+        <w:t>Mejor demorarse para no desmoronarse.</w:t>
+      </w:r>
+    </w:p>
+    <w:p>
+      <w:pPr>
         <w:pStyle w:val="Heading2"/>
       </w:pPr>
       <w:r>
@@ -11074,7 +12721,7 @@
           <w:b w:val="0"/>
           <w:i w:val="0"/>
         </w:rPr>
-        <w:t>No lo hagas todo en un día. Si una actividad te desborda, detente y vuelve con apoyo.</w:t>
+        <w:t>Las fotografías, los audios, los objetos y los relatos de otras personas pueden ayudarte a reconstruir el rostro, la voz y escenas compartidas. Es posible que algunos detalles regresen más adelante; la memoria no siempre vuelve cuando se la obliga.</w:t>
       </w:r>
     </w:p>
     <w:p>
@@ -11085,6 +12732,17 @@
           <w:b w:val="0"/>
           <w:i w:val="0"/>
         </w:rPr>
+        <w:t>No lo hagas todo en un día. Si una imagen o un objeto te produce mucha ansiedad, detente, orienta la mirada hacia el lugar donde estás, afloja el cuerpo y respira sin forzarte. Puedes retomarlo otro día o con alguien de confianza. Trátate con compasión: exigirte recordar con exactitud aumenta la ansiedad y puede dificultar todavía más el recuerdo.</w:t>
+      </w:r>
+    </w:p>
+    <w:p>
+      <w:pPr/>
+      <w:r>
+        <w:rPr>
+          <w:rFonts w:ascii="Georgia" w:hAnsi="Georgia"/>
+          <w:b w:val="0"/>
+          <w:i w:val="0"/>
+        </w:rPr>
         <w:t>El miedo a olvidar un rostro o una voz es frecuente. No recordar cada detalle no equivale a olvidar el vínculo.</w:t>
       </w:r>
     </w:p>
@@ -11225,6 +12883,32 @@
     </w:p>
     <w:p>
       <w:pPr>
+        <w:pStyle w:val="BlockQuote"/>
+      </w:pPr>
+      <w:r>
+        <w:rPr>
+          <w:rFonts w:ascii="Georgia" w:hAnsi="Georgia"/>
+          <w:b w:val="0"/>
+          <w:i/>
+        </w:rPr>
+        <w:t>Hay dolores que no se superan: se transforman.</w:t>
+      </w:r>
+    </w:p>
+    <w:p>
+      <w:pPr>
+        <w:pStyle w:val="BlockQuote"/>
+      </w:pPr>
+      <w:r>
+        <w:rPr>
+          <w:rFonts w:ascii="Georgia" w:hAnsi="Georgia"/>
+          <w:b w:val="0"/>
+          <w:i/>
+        </w:rPr>
+        <w:t>Sanar no es volver a ser quien eras, sino descubrir quién puede ser ahora.</w:t>
+      </w:r>
+    </w:p>
+    <w:p>
+      <w:pPr>
         <w:pStyle w:val="Heading2"/>
       </w:pPr>
       <w:r>
@@ -11256,6 +12940,32 @@
           <w:i w:val="0"/>
         </w:rPr>
         <w:t>La herida del duelo se parece a una cicatriz. Puede doler cuando cambia el tiempo o cuando algo la roza. Con los años puede seguir visible sin estar abierta todos los días. No buscamos arrancarla. Buscamos que no gobierne todo el cuerpo.</w:t>
+      </w:r>
+    </w:p>
+    <w:p>
+      <w:pPr>
+        <w:pStyle w:val="BlockQuote"/>
+      </w:pPr>
+      <w:r>
+        <w:rPr>
+          <w:rFonts w:ascii="Georgia" w:hAnsi="Georgia"/>
+          <w:b w:val="0"/>
+          <w:i/>
+        </w:rPr>
+        <w:t>La vida transcurre entre rotura y sutura.</w:t>
+      </w:r>
+    </w:p>
+    <w:p>
+      <w:pPr>
+        <w:pStyle w:val="BlockQuote"/>
+      </w:pPr>
+      <w:r>
+        <w:rPr>
+          <w:rFonts w:ascii="Georgia" w:hAnsi="Georgia"/>
+          <w:b w:val="0"/>
+          <w:i/>
+        </w:rPr>
+        <w:t>El sufrimiento pasa, el haber sufrido no.</w:t>
       </w:r>
     </w:p>
     <w:p>
@@ -11511,6 +13221,219 @@
     </w:p>
     <w:p>
       <w:pPr>
+        <w:pStyle w:val="Heading2"/>
+      </w:pPr>
+      <w:r>
+        <w:rPr>
+          <w:rFonts w:ascii="Georgia" w:hAnsi="Georgia"/>
+          <w:b w:val="0"/>
+          <w:i w:val="0"/>
+        </w:rPr>
+        <w:t>Mis notas</w:t>
+      </w:r>
+    </w:p>
+    <w:p>
+      <w:pPr>
+        <w:pStyle w:val="Worksheet"/>
+      </w:pPr>
+      <w:r>
+        <w:rPr>
+          <w:rFonts w:ascii="Georgia" w:hAnsi="Georgia"/>
+          <w:b w:val="0"/>
+          <w:i w:val="0"/>
+        </w:rPr>
+        <w:t>________________________________________</w:t>
+      </w:r>
+    </w:p>
+    <w:p>
+      <w:pPr>
+        <w:pStyle w:val="Worksheet"/>
+      </w:pPr>
+      <w:r>
+        <w:rPr>
+          <w:rFonts w:ascii="Georgia" w:hAnsi="Georgia"/>
+          <w:b w:val="0"/>
+          <w:i w:val="0"/>
+        </w:rPr>
+        <w:t>________________________________________</w:t>
+      </w:r>
+    </w:p>
+    <w:p>
+      <w:pPr>
+        <w:pStyle w:val="Worksheet"/>
+      </w:pPr>
+      <w:r>
+        <w:rPr>
+          <w:rFonts w:ascii="Georgia" w:hAnsi="Georgia"/>
+          <w:b w:val="0"/>
+          <w:i w:val="0"/>
+        </w:rPr>
+        <w:t>________________________________________</w:t>
+      </w:r>
+    </w:p>
+    <w:p>
+      <w:pPr>
+        <w:pStyle w:val="Worksheet"/>
+      </w:pPr>
+      <w:r>
+        <w:rPr>
+          <w:rFonts w:ascii="Georgia" w:hAnsi="Georgia"/>
+          <w:b w:val="0"/>
+          <w:i w:val="0"/>
+        </w:rPr>
+        <w:t>________________________________________</w:t>
+      </w:r>
+    </w:p>
+    <w:p>
+      <w:pPr>
+        <w:pStyle w:val="Worksheet"/>
+      </w:pPr>
+      <w:r>
+        <w:rPr>
+          <w:rFonts w:ascii="Georgia" w:hAnsi="Georgia"/>
+          <w:b w:val="0"/>
+          <w:i w:val="0"/>
+        </w:rPr>
+        <w:t>________________________________________</w:t>
+      </w:r>
+    </w:p>
+    <w:p>
+      <w:pPr>
+        <w:pStyle w:val="Worksheet"/>
+      </w:pPr>
+      <w:r>
+        <w:rPr>
+          <w:rFonts w:ascii="Georgia" w:hAnsi="Georgia"/>
+          <w:b w:val="0"/>
+          <w:i w:val="0"/>
+        </w:rPr>
+        <w:t>________________________________________</w:t>
+      </w:r>
+    </w:p>
+    <w:p>
+      <w:pPr>
+        <w:pStyle w:val="Worksheet"/>
+      </w:pPr>
+      <w:r>
+        <w:rPr>
+          <w:rFonts w:ascii="Georgia" w:hAnsi="Georgia"/>
+          <w:b w:val="0"/>
+          <w:i w:val="0"/>
+        </w:rPr>
+        <w:t>________________________________________</w:t>
+      </w:r>
+    </w:p>
+    <w:p>
+      <w:pPr>
+        <w:pStyle w:val="Worksheet"/>
+      </w:pPr>
+      <w:r>
+        <w:rPr>
+          <w:rFonts w:ascii="Georgia" w:hAnsi="Georgia"/>
+          <w:b w:val="0"/>
+          <w:i w:val="0"/>
+        </w:rPr>
+        <w:t>________________________________________</w:t>
+      </w:r>
+    </w:p>
+    <w:p>
+      <w:pPr>
+        <w:pStyle w:val="Worksheet"/>
+      </w:pPr>
+      <w:r>
+        <w:rPr>
+          <w:rFonts w:ascii="Georgia" w:hAnsi="Georgia"/>
+          <w:b w:val="0"/>
+          <w:i w:val="0"/>
+        </w:rPr>
+        <w:t>________________________________________</w:t>
+      </w:r>
+    </w:p>
+    <w:p>
+      <w:pPr>
+        <w:pStyle w:val="Worksheet"/>
+      </w:pPr>
+      <w:r>
+        <w:rPr>
+          <w:rFonts w:ascii="Georgia" w:hAnsi="Georgia"/>
+          <w:b w:val="0"/>
+          <w:i w:val="0"/>
+        </w:rPr>
+        <w:t>________________________________________</w:t>
+      </w:r>
+    </w:p>
+    <w:p>
+      <w:pPr>
+        <w:pStyle w:val="Worksheet"/>
+      </w:pPr>
+      <w:r>
+        <w:rPr>
+          <w:rFonts w:ascii="Georgia" w:hAnsi="Georgia"/>
+          <w:b w:val="0"/>
+          <w:i w:val="0"/>
+        </w:rPr>
+        <w:t>________________________________________</w:t>
+      </w:r>
+    </w:p>
+    <w:p>
+      <w:pPr>
+        <w:pStyle w:val="Worksheet"/>
+      </w:pPr>
+      <w:r>
+        <w:rPr>
+          <w:rFonts w:ascii="Georgia" w:hAnsi="Georgia"/>
+          <w:b w:val="0"/>
+          <w:i w:val="0"/>
+        </w:rPr>
+        <w:t>________________________________________</w:t>
+      </w:r>
+    </w:p>
+    <w:p>
+      <w:pPr>
+        <w:pStyle w:val="Worksheet"/>
+      </w:pPr>
+      <w:r>
+        <w:rPr>
+          <w:rFonts w:ascii="Georgia" w:hAnsi="Georgia"/>
+          <w:b w:val="0"/>
+          <w:i w:val="0"/>
+        </w:rPr>
+        <w:t>________________________________________</w:t>
+      </w:r>
+    </w:p>
+    <w:p>
+      <w:pPr>
+        <w:pStyle w:val="Worksheet"/>
+      </w:pPr>
+      <w:r>
+        <w:rPr>
+          <w:rFonts w:ascii="Georgia" w:hAnsi="Georgia"/>
+          <w:b w:val="0"/>
+          <w:i w:val="0"/>
+        </w:rPr>
+        <w:t>________________________________________</w:t>
+      </w:r>
+    </w:p>
+    <w:p>
+      <w:pPr>
+        <w:pStyle w:val="Worksheet"/>
+      </w:pPr>
+      <w:r>
+        <w:rPr>
+          <w:rFonts w:ascii="Georgia" w:hAnsi="Georgia"/>
+          <w:b w:val="0"/>
+          <w:i w:val="0"/>
+        </w:rPr>
+        <w:t>________________________________________</w:t>
+      </w:r>
+    </w:p>
+    <w:p>
+      <w:r>
+        <w:br w:type="page"/>
+      </w:r>
+    </w:p>
+    <w:p>
+      <w:pPr>
         <w:pStyle w:val="Heading1"/>
         <w:pageBreakBefore/>
       </w:pPr>
@@ -12660,6 +14583,19 @@
           <w:i w:val="0"/>
         </w:rPr>
         <w:t>No voy a decirte que seas fuerte. Tal vez ya has sido fuerte demasiado tiempo.</w:t>
+      </w:r>
+    </w:p>
+    <w:p>
+      <w:pPr>
+        <w:pStyle w:val="BlockQuote"/>
+      </w:pPr>
+      <w:r>
+        <w:rPr>
+          <w:rFonts w:ascii="Georgia" w:hAnsi="Georgia"/>
+          <w:b w:val="0"/>
+          <w:i/>
+        </w:rPr>
+        <w:t>No pedir fortaleza a quien todavía está recogiendo sus pedazos.</w:t>
       </w:r>
     </w:p>
     <w:p>
@@ -13433,9 +15369,9 @@
       <w:rPr>
         <w:rFonts w:ascii="Georgia" w:hAnsi="Georgia"/>
         <w:color w:val="66737C"/>
-        <w:sz w:val="16"/>
-      </w:rPr>
-      <w:t>GUÍA DE RECONSTRUCCIÓN PSICOLÓGICA</w:t>
+        <w:sz w:val="13"/>
+      </w:rPr>
+      <w:t>GUÍA DE RECONSTRUCCIÓN PSICOLÓGICA DE UNA CATÁSTROFE</w:t>
     </w:r>
   </w:p>
 </w:hdr>
@@ -25730,6 +27666,7 @@
   <w:style w:type="paragraph" w:customStyle="1" w:styleId="BlockQuote">
     <w:name w:val="Block Quote"/>
     <w:pPr>
+      <w:keepLines/>
       <w:spacing w:before="140" w:after="180" w:line="300" w:lineRule="auto"/>
       <w:ind w:left="432" w:right="288"/>
     </w:pPr>

</xml_diff>